<commit_message>
modificaciones acciones de tabla
</commit_message>
<xml_diff>
--- a/uploads/contratos/Contrato - BRANDON GONZALEZ.docx
+++ b/uploads/contratos/Contrato - BRANDON GONZALEZ.docx
@@ -684,37 +684,21 @@
           <w:rFonts w:ascii="Arial" w:eastAsia="Arial" w:hAnsi="Arial" w:cs="Arial"/>
           <w:color w:val="000000"/>
         </w:rPr>
+        <w:t xml:space="preserve"> años de edad, sexo</w:t>
+      </w:r>
+      <w:r>
+        <w:rPr>
+          <w:rFonts w:ascii="Arial" w:eastAsia="Arial" w:hAnsi="Arial" w:cs="Arial"/>
+        </w:rPr>
         <w:t xml:space="preserve"> </w:t>
       </w:r>
-      <w:proofErr w:type="gramStart"/>
-      <w:r>
-        <w:rPr>
-          <w:rFonts w:ascii="Arial" w:eastAsia="Arial" w:hAnsi="Arial" w:cs="Arial"/>
-          <w:color w:val="000000"/>
-        </w:rPr>
-        <w:t>años de edad</w:t>
-      </w:r>
-      <w:proofErr w:type="gramEnd"/>
-      <w:r>
-        <w:rPr>
-          <w:rFonts w:ascii="Arial" w:eastAsia="Arial" w:hAnsi="Arial" w:cs="Arial"/>
-          <w:color w:val="000000"/>
-        </w:rPr>
-        <w:t>, sexo</w:t>
-      </w:r>
-      <w:r>
-        <w:rPr>
-          <w:rFonts w:ascii="Arial" w:eastAsia="Arial" w:hAnsi="Arial" w:cs="Arial"/>
-        </w:rPr>
-        <w:t xml:space="preserve"> </w:t>
-      </w:r>
-      <w:r>
-        <w:rPr>
-          <w:rFonts w:ascii="Arial" w:eastAsia="Arial" w:hAnsi="Arial" w:cs="Arial"/>
-          <w:b/>
-          <w:bCs/>
-        </w:rPr>
-        <w:t>Masculino</w:t>
+      <w:r>
+        <w:rPr>
+          <w:rFonts w:ascii="Arial" w:eastAsia="Arial" w:hAnsi="Arial" w:cs="Arial"/>
+          <w:b/>
+          <w:bCs/>
+        </w:rPr>
+        <w:t>masculino</w:t>
       </w:r>
       <w:r>
         <w:rPr>
@@ -829,23 +813,23 @@
           <w:b/>
           <w:bCs/>
         </w:rPr>
-        <w:t>JULIAN VILLAGRAN </w:t>
-      </w:r>
-      <w:r>
-        <w:rPr>
-          <w:rFonts w:ascii="Arial" w:eastAsia="Arial" w:hAnsi="Arial" w:cs="Arial"/>
-          <w:b/>
-          <w:bCs/>
-        </w:rPr>
-        <w:t>10 </w:t>
-      </w:r>
-      <w:r>
-        <w:rPr>
-          <w:rFonts w:ascii="Arial" w:eastAsia="Arial" w:hAnsi="Arial" w:cs="Arial"/>
-          <w:b/>
-          <w:bCs/>
-        </w:rPr>
-        <w:t>PACHUCA</w:t>
+        <w:t>JULIAN VILLAGRAN</w:t>
+      </w:r>
+      <w:r>
+        <w:rPr>
+          <w:rFonts w:ascii="Arial" w:eastAsia="Arial" w:hAnsi="Arial" w:cs="Arial"/>
+          <w:b/>
+          <w:bCs/>
+        </w:rPr>
+        <w:t xml:space="preserve"> </w:t>
+      </w:r>
+      <w:r>
+        <w:rPr>
+          <w:rFonts w:ascii="Arial" w:eastAsia="Arial" w:hAnsi="Arial" w:cs="Arial"/>
+          <w:b/>
+          <w:bCs/>
+        </w:rPr>
+        <w:t>10 PACHUCA</w:t>
       </w:r>
       <w:r>
         <w:rPr>
@@ -1073,23 +1057,7 @@
           <w:rFonts w:ascii="Arial" w:eastAsia="Arial" w:hAnsi="Arial" w:cs="Arial"/>
           <w:color w:val="000000"/>
         </w:rPr>
-        <w:t xml:space="preserve">Que, SI </w:t>
-      </w:r>
-      <w:proofErr w:type="gramStart"/>
-      <w:r>
-        <w:rPr>
-          <w:rFonts w:ascii="Arial" w:eastAsia="Arial" w:hAnsi="Arial" w:cs="Arial"/>
-          <w:color w:val="000000"/>
-        </w:rPr>
-        <w:t xml:space="preserve">(  </w:t>
-      </w:r>
-      <w:proofErr w:type="gramEnd"/>
-      <w:r>
-        <w:rPr>
-          <w:rFonts w:ascii="Arial" w:eastAsia="Arial" w:hAnsi="Arial" w:cs="Arial"/>
-          <w:color w:val="000000"/>
-        </w:rPr>
-        <w:t xml:space="preserve"> ) NO (   ) tiene contrato o crédito hipotecario vigente con el INFONAVIT.</w:t>
+        <w:t>Que, SI (   ) NO (   ) tiene contrato o crédito hipotecario vigente con el INFONAVIT.</w:t>
       </w:r>
     </w:p>
     <w:p>
@@ -1136,23 +1104,7 @@
           <w:rFonts w:ascii="Arial" w:eastAsia="Arial" w:hAnsi="Arial" w:cs="Arial"/>
           <w:color w:val="000000"/>
         </w:rPr>
-        <w:t xml:space="preserve">Que, SI </w:t>
-      </w:r>
-      <w:proofErr w:type="gramStart"/>
-      <w:r>
-        <w:rPr>
-          <w:rFonts w:ascii="Arial" w:eastAsia="Arial" w:hAnsi="Arial" w:cs="Arial"/>
-          <w:color w:val="000000"/>
-        </w:rPr>
-        <w:t>(  )</w:t>
-      </w:r>
-      <w:proofErr w:type="gramEnd"/>
-      <w:r>
-        <w:rPr>
-          <w:rFonts w:ascii="Arial" w:eastAsia="Arial" w:hAnsi="Arial" w:cs="Arial"/>
-          <w:color w:val="000000"/>
-        </w:rPr>
-        <w:t xml:space="preserve"> NO (  ) tiene una resolución judicial en contra, en materia de PENSIÓN ALIMENTICIA.</w:t>
+        <w:t>Que, SI (  ) NO (  ) tiene una resolución judicial en contra, en materia de PENSIÓN ALIMENTICIA.</w:t>
       </w:r>
     </w:p>
     <w:p>
@@ -1698,21 +1650,7 @@
         <w:rPr>
           <w:rFonts w:ascii="Arial" w:eastAsia="Arial" w:hAnsi="Arial" w:cs="Arial"/>
         </w:rPr>
-        <w:t xml:space="preserve"> imponer las sanciones y descuentos salariales, por los días no trabajados o por la acumulación de retardos en un mes, </w:t>
-      </w:r>
-      <w:proofErr w:type="gramStart"/>
-      <w:r>
-        <w:rPr>
-          <w:rFonts w:ascii="Arial" w:eastAsia="Arial" w:hAnsi="Arial" w:cs="Arial"/>
-        </w:rPr>
-        <w:t>de acuerdo al</w:t>
-      </w:r>
-      <w:proofErr w:type="gramEnd"/>
-      <w:r>
-        <w:rPr>
-          <w:rFonts w:ascii="Arial" w:eastAsia="Arial" w:hAnsi="Arial" w:cs="Arial"/>
-        </w:rPr>
-        <w:t xml:space="preserve"> Reglamento Interior de Trabajo.</w:t>
+        <w:t xml:space="preserve"> imponer las sanciones y descuentos salariales, por los días no trabajados o por la acumulación de retardos en un mes, de acuerdo al Reglamento Interior de Trabajo.</w:t>
       </w:r>
     </w:p>
     <w:p>
@@ -1989,21 +1927,7 @@
         <w:rPr>
           <w:rFonts w:ascii="Arial" w:eastAsia="Arial" w:hAnsi="Arial" w:cs="Arial"/>
         </w:rPr>
-        <w:t xml:space="preserve"> le pagará una cantidad proporcional a la cantidad arriba mencionada, de acuerdo con el tiempo </w:t>
-      </w:r>
-      <w:proofErr w:type="gramStart"/>
-      <w:r>
-        <w:rPr>
-          <w:rFonts w:ascii="Arial" w:eastAsia="Arial" w:hAnsi="Arial" w:cs="Arial"/>
-        </w:rPr>
-        <w:t>efectivamente</w:t>
-      </w:r>
-      <w:proofErr w:type="gramEnd"/>
-      <w:r>
-        <w:rPr>
-          <w:rFonts w:ascii="Arial" w:eastAsia="Arial" w:hAnsi="Arial" w:cs="Arial"/>
-        </w:rPr>
-        <w:t xml:space="preserve"> laborado, igualmente de conformidad con lo dispuesto por el artículo citado.</w:t>
+        <w:t xml:space="preserve"> le pagará una cantidad proporcional a la cantidad arriba mencionada, de acuerdo con el tiempo efectivamente laborado, igualmente de conformidad con lo dispuesto por el artículo citado.</w:t>
       </w:r>
     </w:p>
     <w:p>
@@ -2041,21 +1965,7 @@
         <w:rPr>
           <w:rFonts w:ascii="Arial" w:eastAsia="Arial" w:hAnsi="Arial" w:cs="Arial"/>
         </w:rPr>
-        <w:t xml:space="preserve"> tendrá derecho a disfrutar de un periodo anual de vacaciones según lo establecido en el artículo 76 de la Ley Federal del Trabajo, tomando en consideración la antigüedad en el trabajo, así como a disfrutar del salario que le corresponda. De igual modo recibirá la Prima Vacacional respectiva, equivalente al 25% del importe pagado por vacaciones </w:t>
-      </w:r>
-      <w:proofErr w:type="gramStart"/>
-      <w:r>
-        <w:rPr>
-          <w:rFonts w:ascii="Arial" w:eastAsia="Arial" w:hAnsi="Arial" w:cs="Arial"/>
-        </w:rPr>
-        <w:t>de acuerdo al</w:t>
-      </w:r>
-      <w:proofErr w:type="gramEnd"/>
-      <w:r>
-        <w:rPr>
-          <w:rFonts w:ascii="Arial" w:eastAsia="Arial" w:hAnsi="Arial" w:cs="Arial"/>
-        </w:rPr>
-        <w:t xml:space="preserve"> artículo 80 de la Ley citada</w:t>
+        <w:t xml:space="preserve"> tendrá derecho a disfrutar de un periodo anual de vacaciones según lo establecido en el artículo 76 de la Ley Federal del Trabajo, tomando en consideración la antigüedad en el trabajo, así como a disfrutar del salario que le corresponda. De igual modo recibirá la Prima Vacacional respectiva, equivalente al 25% del importe pagado por vacaciones de acuerdo al artículo 80 de la Ley citada</w:t>
       </w:r>
     </w:p>
     <w:p>
@@ -2399,23 +2309,7 @@
           <w:rFonts w:ascii="Arial" w:eastAsia="Arial" w:hAnsi="Arial" w:cs="Arial"/>
           <w:color w:val="000000"/>
         </w:rPr>
-        <w:t xml:space="preserve">Ambas partes están de acuerdo que en caso de fuerza mayor debidamente acreditada y de ser posible, el trabajo en la modalidad de presencial será cambiado a teletrabajo </w:t>
-      </w:r>
-      <w:proofErr w:type="gramStart"/>
-      <w:r>
-        <w:rPr>
-          <w:rFonts w:ascii="Arial" w:eastAsia="Arial" w:hAnsi="Arial" w:cs="Arial"/>
-          <w:color w:val="000000"/>
-        </w:rPr>
-        <w:t>de acuerdo a</w:t>
-      </w:r>
-      <w:proofErr w:type="gramEnd"/>
-      <w:r>
-        <w:rPr>
-          <w:rFonts w:ascii="Arial" w:eastAsia="Arial" w:hAnsi="Arial" w:cs="Arial"/>
-          <w:color w:val="000000"/>
-        </w:rPr>
-        <w:t xml:space="preserve"> lo estipulado en el artículo 330-G de la Ley Federal del Trabajo y una vez que termine la causa que originó dicho cambio se podrá dar la reversibilidad a la modalidad presencial.</w:t>
+        <w:t>Ambas partes están de acuerdo que en caso de fuerza mayor debidamente acreditada y de ser posible, el trabajo en la modalidad de presencial será cambiado a teletrabajo de acuerdo a lo estipulado en el artículo 330-G de la Ley Federal del Trabajo y una vez que termine la causa que originó dicho cambio se podrá dar la reversibilidad a la modalidad presencial.</w:t>
       </w:r>
     </w:p>
     <w:p>
@@ -2561,21 +2455,7 @@
         <w:rPr>
           <w:rFonts w:ascii="Arial" w:eastAsia="Arial" w:hAnsi="Arial" w:cs="Arial"/>
         </w:rPr>
-        <w:t xml:space="preserve">podrá dar por rescindido el presente contrato sin responsabilidad alguna, cuando el trabajador incurra en alguna de las causales establecidas por el artículo 47 y 185 de la Ley Federal del Trabajo y las que se consideren como falta de probidad </w:t>
-      </w:r>
-      <w:proofErr w:type="gramStart"/>
-      <w:r>
-        <w:rPr>
-          <w:rFonts w:ascii="Arial" w:eastAsia="Arial" w:hAnsi="Arial" w:cs="Arial"/>
-        </w:rPr>
-        <w:t>en razón de</w:t>
-      </w:r>
-      <w:proofErr w:type="gramEnd"/>
-      <w:r>
-        <w:rPr>
-          <w:rFonts w:ascii="Arial" w:eastAsia="Arial" w:hAnsi="Arial" w:cs="Arial"/>
-        </w:rPr>
-        <w:t xml:space="preserve"> la importancia del cumplimiento o realice cualquiera de los actos prohibidos por las políticas, el Reglamento Interno o los Manuales de la empresa. </w:t>
+        <w:t xml:space="preserve">podrá dar por rescindido el presente contrato sin responsabilidad alguna, cuando el trabajador incurra en alguna de las causales establecidas por el artículo 47 y 185 de la Ley Federal del Trabajo y las que se consideren como falta de probidad en razón de la importancia del cumplimiento o realice cualquiera de los actos prohibidos por las políticas, el Reglamento Interno o los Manuales de la empresa. </w:t>
       </w:r>
     </w:p>
     <w:p>
@@ -7608,25 +7488,7 @@
                 <w:sz w:val="16"/>
                 <w:szCs w:val="16"/>
               </w:rPr>
-              <w:t xml:space="preserve">Nombre y Firma del </w:t>
-            </w:r>
-            <w:proofErr w:type="gramStart"/>
-            <w:r>
-              <w:rPr>
-                <w:color w:val="FFFFFF"/>
-                <w:sz w:val="16"/>
-                <w:szCs w:val="16"/>
-              </w:rPr>
-              <w:t>Responsable</w:t>
-            </w:r>
-            <w:proofErr w:type="gramEnd"/>
-            <w:r>
-              <w:rPr>
-                <w:color w:val="FFFFFF"/>
-                <w:sz w:val="16"/>
-                <w:szCs w:val="16"/>
-              </w:rPr>
-              <w:t xml:space="preserve"> de Recursos Humanos</w:t>
+              <w:t>Nombre y Firma del Responsable de Recursos Humanos</w:t>
             </w:r>
           </w:p>
         </w:tc>

</xml_diff>